<commit_message>
Fix broken markdown links in documentation validation script
- Enhanced the handling of broken links by replacing them with plain text instead of leaving them as dead links.
- Added logging for the unlinking process to provide better feedback during the validation.
- Maintained the existing functionality for replacing valid links with their new relative paths, including the "WhatIf" mode for testing changes without applying them.
</commit_message>
<xml_diff>
--- a/docx/Automation/BitBucket_Code_Map_Automations.docx
+++ b/docx/Automation/BitBucket_Code_Map_Automations.docx
@@ -2,7 +2,7 @@
 <file path=word/document.xml><?xml version="1.0" encoding="utf-8"?>
 <w:document xmlns:w="http://schemas.openxmlformats.org/wordprocessingml/2006/main" xmlns:m="http://schemas.openxmlformats.org/officeDocument/2006/math" xmlns:r="http://schemas.openxmlformats.org/officeDocument/2006/relationships" xmlns:o="urn:schemas-microsoft-com:office:office" xmlns:v="urn:schemas-microsoft-com:vml" xmlns:w10="urn:schemas-microsoft-com:office:word" xmlns:a="http://schemas.openxmlformats.org/drawingml/2006/main" xmlns:pic="http://schemas.openxmlformats.org/drawingml/2006/picture" xmlns:wp="http://schemas.openxmlformats.org/drawingml/2006/wordprocessingDrawing">
   <w:body>
-    <w:bookmarkStart w:id="359" w:name="sec1"/>
+    <w:bookmarkStart w:id="358" w:name="sec1"/>
     <w:p>
       <w:pPr>
         <w:pStyle w:val="Heading1"/>
@@ -17975,7 +17975,7 @@
       </w:r>
     </w:p>
     <w:bookmarkEnd w:id="328"/>
-    <w:bookmarkStart w:id="357" w:name="sec63"/>
+    <w:bookmarkStart w:id="356" w:name="sec63"/>
     <w:p>
       <w:pPr>
         <w:pStyle w:val="Heading2"/>
@@ -17984,7 +17984,7 @@
         <w:t xml:space="preserve">19. Testing</w:t>
       </w:r>
     </w:p>
-    <w:bookmarkStart w:id="349" w:name="sec64"/>
+    <w:bookmarkStart w:id="348" w:name="sec64"/>
     <w:p>
       <w:pPr>
         <w:pStyle w:val="Heading3"/>
@@ -18688,14 +18688,12 @@
             <w:pPr>
               <w:pStyle w:val="Compact"/>
             </w:pPr>
-            <w:hyperlink r:id="rId348">
-              <w:r>
-                <w:rPr>
-                  <w:rStyle w:val="VerbatimChar"/>
-                </w:rPr>
-                <w:t xml:space="preserve">Update-WindowsSecurity.Unit.Tests.ps1</w:t>
-              </w:r>
-            </w:hyperlink>
+            <w:r>
+              <w:rPr>
+                <w:rStyle w:val="VerbatimChar"/>
+              </w:rPr>
+              <w:t xml:space="preserve">Update-WindowsSecurity.Unit.Tests.ps1</w:t>
+            </w:r>
           </w:p>
         </w:tc>
         <w:tc>
@@ -18711,8 +18709,8 @@
         </w:tc>
       </w:tr>
     </w:tbl>
-    <w:bookmarkEnd w:id="349"/>
-    <w:bookmarkStart w:id="355" w:name="sec65"/>
+    <w:bookmarkEnd w:id="348"/>
+    <w:bookmarkStart w:id="354" w:name="sec65"/>
     <w:p>
       <w:pPr>
         <w:pStyle w:val="Heading3"/>
@@ -18774,7 +18772,7 @@
             <w:pPr>
               <w:pStyle w:val="Compact"/>
             </w:pPr>
-            <w:hyperlink r:id="rId350">
+            <w:hyperlink r:id="rId349">
               <w:r>
                 <w:rPr>
                   <w:rStyle w:val="VerbatimChar"/>
@@ -18803,7 +18801,7 @@
             <w:pPr>
               <w:pStyle w:val="Compact"/>
             </w:pPr>
-            <w:hyperlink r:id="rId351">
+            <w:hyperlink r:id="rId350">
               <w:r>
                 <w:rPr>
                   <w:rStyle w:val="VerbatimChar"/>
@@ -18832,7 +18830,7 @@
             <w:pPr>
               <w:pStyle w:val="Compact"/>
             </w:pPr>
-            <w:hyperlink r:id="rId352">
+            <w:hyperlink r:id="rId351">
               <w:r>
                 <w:rPr>
                   <w:rStyle w:val="VerbatimChar"/>
@@ -18861,7 +18859,7 @@
             <w:pPr>
               <w:pStyle w:val="Compact"/>
             </w:pPr>
-            <w:hyperlink r:id="rId353">
+            <w:hyperlink r:id="rId352">
               <w:r>
                 <w:rPr>
                   <w:rStyle w:val="VerbatimChar"/>
@@ -18890,7 +18888,7 @@
             <w:pPr>
               <w:pStyle w:val="Compact"/>
             </w:pPr>
-            <w:hyperlink r:id="rId354">
+            <w:hyperlink r:id="rId353">
               <w:r>
                 <w:rPr>
                   <w:rStyle w:val="VerbatimChar"/>
@@ -18913,8 +18911,8 @@
         </w:tc>
       </w:tr>
     </w:tbl>
-    <w:bookmarkEnd w:id="355"/>
-    <w:bookmarkStart w:id="356" w:name="sec66"/>
+    <w:bookmarkEnd w:id="354"/>
+    <w:bookmarkStart w:id="355" w:name="sec66"/>
     <w:p>
       <w:pPr>
         <w:pStyle w:val="Heading3"/>
@@ -19093,9 +19091,9 @@
         </w:pict>
       </w:r>
     </w:p>
+    <w:bookmarkEnd w:id="355"/>
     <w:bookmarkEnd w:id="356"/>
-    <w:bookmarkEnd w:id="357"/>
-    <w:bookmarkStart w:id="358" w:name="sec67"/>
+    <w:bookmarkStart w:id="357" w:name="sec67"/>
     <w:p>
       <w:pPr>
         <w:pStyle w:val="Heading2"/>
@@ -20306,8 +20304,8 @@
         </w:tc>
       </w:tr>
     </w:tbl>
+    <w:bookmarkEnd w:id="357"/>
     <w:bookmarkEnd w:id="358"/>
-    <w:bookmarkEnd w:id="359"/>
     <w:sectPr>
       <w:pgSz w:w="16838" w:h="11906" w:orient="landscape"/>
       <w:footnotePr>

</xml_diff>